<commit_message>
feat(export): customer logo on Civil1 cover + "Powered by Civil1.ai" mark
The customer's logo now leads the Civil1 cover (tenant logo_s3_key -> docxtpl InlineImage, height-constrained), with the firm name as a graceful fallback when no logo is uploaded. Adds a discreet "Powered by Civil1.ai" mark in the cover corner and footer (baked wordmark now; swaps to a brand PNG at assets/branding/civil1_mark.png automatically). Fidelity re-verified through the LibreOffice PDF path.

Co-authored-by: Cursor <cursoragent@cursor.com>
</commit_message>
<xml_diff>
--- a/assets/templates/civil1_study_v1.docx
+++ b/assets/templates/civil1_study_v1.docx
@@ -2,53 +2,35 @@
 <file path=word/document.xml><?xml version="1.0" encoding="utf-8"?>
 <w:document xmlns:wpc="http://schemas.microsoft.com/office/word/2010/wordprocessingCanvas" xmlns:mo="http://schemas.microsoft.com/office/mac/office/2008/main" xmlns:mc="http://schemas.openxmlformats.org/markup-compatibility/2006" xmlns:mv="urn:schemas-microsoft-com:mac:vml" xmlns:o="urn:schemas-microsoft-com:office:office" xmlns:r="http://schemas.openxmlformats.org/officeDocument/2006/relationships" xmlns:m="http://schemas.openxmlformats.org/officeDocument/2006/math" xmlns:v="urn:schemas-microsoft-com:vml" xmlns:wp14="http://schemas.microsoft.com/office/word/2010/wordprocessingDrawing" xmlns:wp="http://schemas.openxmlformats.org/drawingml/2006/wordprocessingDrawing" xmlns:w10="urn:schemas-microsoft-com:office:word" xmlns:w="http://schemas.openxmlformats.org/wordprocessingml/2006/main" xmlns:w14="http://schemas.microsoft.com/office/word/2010/wordml" xmlns:wpg="http://schemas.microsoft.com/office/word/2010/wordprocessingGroup" xmlns:wpi="http://schemas.microsoft.com/office/word/2010/wordprocessingInk" xmlns:wne="http://schemas.microsoft.com/office/word/2006/wordml" xmlns:wps="http://schemas.microsoft.com/office/word/2010/wordprocessingShape" mc:Ignorable="w14 wp14">
   <w:body>
-    <w:tbl>
-      <w:tblPr>
-        <w:tblW w:type="auto" w:w="0"/>
-        <w:jc w:val="center"/>
-        <w:tblLayout w:type="fixed"/>
-        <w:tblLook w:firstColumn="1" w:firstRow="1" w:lastColumn="0" w:lastRow="0" w:noHBand="0" w:noVBand="1" w:val="04A0"/>
-        <w:tblBorders>
-          <w:top w:val="nil"/>
-          <w:left w:val="nil"/>
-          <w:bottom w:val="nil"/>
-          <w:right w:val="nil"/>
-          <w:insideH w:val="nil"/>
-          <w:insideV w:val="nil"/>
-        </w:tblBorders>
-        <w:tblCellMar>
-          <w:top w:w="120" w:type="dxa"/>
-          <w:left w:w="100" w:type="dxa"/>
-          <w:bottom w:w="120" w:type="dxa"/>
-          <w:right w:w="100" w:type="dxa"/>
-        </w:tblCellMar>
-      </w:tblPr>
-      <w:tblGrid>
-        <w:gridCol w:w="9360"/>
-      </w:tblGrid>
-      <w:tr>
-        <w:tc>
-          <w:tcPr>
-            <w:tcW w:type="dxa" w:w="9648"/>
-            <w:shd w:val="clear" w:fill="144A66"/>
-          </w:tcPr>
-          <w:p>
-            <w:pPr>
-              <w:spacing w:after="0"/>
-            </w:pPr>
-            <w:r>
-              <w:rPr>
-                <w:rFonts w:ascii="Libre Franklin" w:hAnsi="Libre Franklin"/>
-                <w:b/>
-                <w:color w:val="FFFFFF"/>
-                <w:sz w:val="24"/>
-              </w:rPr>
-              <w:t>{{ firm_name }}</w:t>
-            </w:r>
-          </w:p>
-        </w:tc>
-      </w:tr>
-    </w:tbl>
+    <w:p>
+      <w:pPr>
+        <w:spacing w:after="120"/>
+        <w:jc w:val="left"/>
+      </w:pPr>
+      <w:r>
+        <w:t>{{ customer_logo }}</w:t>
+      </w:r>
+    </w:p>
+    <w:p>
+      <w:r>
+        <w:rPr>
+          <w:rFonts w:ascii="Libre Franklin" w:hAnsi="Libre Franklin"/>
+          <w:b/>
+          <w:color w:val="144A66"/>
+          <w:sz w:val="26"/>
+        </w:rPr>
+        <w:t>{{ firm_name }}</w:t>
+      </w:r>
+    </w:p>
+    <w:p>
+      <w:pPr>
+        <w:pBdr>
+          <w:bottom w:val="single" w:sz="12" w:color="144A66"/>
+        </w:pBdr>
+        <w:spacing w:after="40"/>
+      </w:pPr>
+    </w:p>
+    <w:p/>
     <w:p/>
     <w:p/>
     <w:p/>
@@ -305,15 +287,6 @@
     <w:p/>
     <w:p/>
     <w:p/>
-    <w:p/>
-    <w:p>
-      <w:r>
-        <w:rPr>
-          <w:b/>
-        </w:rPr>
-        <w:t>{{ firm_name }}</w:t>
-      </w:r>
-    </w:p>
     <w:p>
       <w:r>
         <w:rPr>
@@ -328,6 +301,29 @@
           <w:color w:val="5A6672"/>
         </w:rPr>
         <w:t>{{ firm_phone }}</w:t>
+      </w:r>
+    </w:p>
+    <w:p>
+      <w:pPr>
+        <w:spacing w:before="120"/>
+        <w:jc w:val="right"/>
+      </w:pPr>
+      <w:r>
+        <w:rPr>
+          <w:rFonts w:ascii="Source Sans 3" w:hAnsi="Source Sans 3"/>
+          <w:color w:val="5A6672"/>
+          <w:sz w:val="16"/>
+        </w:rPr>
+        <w:t xml:space="preserve">Powered by </w:t>
+      </w:r>
+      <w:r>
+        <w:rPr>
+          <w:rFonts w:ascii="Libre Franklin" w:hAnsi="Libre Franklin"/>
+          <w:b/>
+          <w:color w:val="144A66"/>
+          <w:sz w:val="17"/>
+        </w:rPr>
+        <w:t>Civil1.ai</w:t>
       </w:r>
     </w:p>
     <w:p>
@@ -2204,7 +2200,7 @@
         <w:color w:val="5A6672"/>
         <w:sz w:val="16"/>
       </w:rPr>
-      <w:t xml:space="preserve"> · Prepared with Civil1</w:t>
+      <w:t xml:space="preserve"> · Powered by Civil1.ai</w:t>
     </w:r>
   </w:p>
 </w:ftr>

</xml_diff>

<commit_message>
fix(export): Civil1 cover/TOC/NA presentation polish
Dedupe address-named projects on the cover, omit empty recommendation
slots, replace the Word TOC field with a static outline for LibreOffice
PDF, and strip missing-only paragraphs/table rows after render.
</commit_message>
<xml_diff>
--- a/assets/templates/civil1_study_v1.docx
+++ b/assets/templates/civil1_study_v1.docx
@@ -32,9 +32,6 @@
     </w:p>
     <w:p/>
     <w:p/>
-    <w:p/>
-    <w:p/>
-    <w:p/>
     <w:p>
       <w:pPr>
         <w:pStyle w:val="Title"/>
@@ -45,10 +42,26 @@
     </w:p>
     <w:p>
       <w:pPr>
+        <w:spacing w:after="0"/>
+      </w:pPr>
+      <w:r>
+        <w:t>{%p if cover_project_name %}</w:t>
+      </w:r>
+    </w:p>
+    <w:p>
+      <w:pPr>
         <w:pStyle w:val="Subtitle"/>
       </w:pPr>
       <w:r>
-        <w:t>{{ project_name }}</w:t>
+        <w:t>{{ cover_project_name }}</w:t>
+      </w:r>
+    </w:p>
+    <w:p>
+      <w:pPr>
+        <w:spacing w:after="0"/>
+      </w:pPr>
+      <w:r>
+        <w:t>{%p endif %}</w:t>
       </w:r>
     </w:p>
     <w:p>
@@ -282,9 +295,6 @@
         </w:tc>
       </w:tr>
     </w:tbl>
-    <w:p/>
-    <w:p/>
-    <w:p/>
     <w:p/>
     <w:p/>
     <w:p>
@@ -670,10 +680,34 @@
     </w:p>
     <w:p>
       <w:pPr>
+        <w:spacing w:after="0"/>
+      </w:pPr>
+      <w:r>
+        <w:t>{%p if recommendation_1 %}</w:t>
+      </w:r>
+    </w:p>
+    <w:p>
+      <w:pPr>
         <w:pStyle w:val="ListNumber"/>
       </w:pPr>
       <w:r>
         <w:t>{{ recommendation_1 }}</w:t>
+      </w:r>
+    </w:p>
+    <w:p>
+      <w:pPr>
+        <w:spacing w:after="0"/>
+      </w:pPr>
+      <w:r>
+        <w:t>{%p endif %}</w:t>
+      </w:r>
+    </w:p>
+    <w:p>
+      <w:pPr>
+        <w:spacing w:after="0"/>
+      </w:pPr>
+      <w:r>
+        <w:t>{%p if recommendation_2 %}</w:t>
       </w:r>
     </w:p>
     <w:p>
@@ -686,10 +720,42 @@
     </w:p>
     <w:p>
       <w:pPr>
+        <w:spacing w:after="0"/>
+      </w:pPr>
+      <w:r>
+        <w:t>{%p endif %}</w:t>
+      </w:r>
+    </w:p>
+    <w:p>
+      <w:pPr>
+        <w:spacing w:after="0"/>
+      </w:pPr>
+      <w:r>
+        <w:t>{%p if recommendation_3 %}</w:t>
+      </w:r>
+    </w:p>
+    <w:p>
+      <w:pPr>
         <w:pStyle w:val="ListNumber"/>
       </w:pPr>
       <w:r>
         <w:t>{{ recommendation_3 }}</w:t>
+      </w:r>
+    </w:p>
+    <w:p>
+      <w:pPr>
+        <w:spacing w:after="0"/>
+      </w:pPr>
+      <w:r>
+        <w:t>{%p endif %}</w:t>
+      </w:r>
+    </w:p>
+    <w:p>
+      <w:pPr>
+        <w:spacing w:after="0"/>
+      </w:pPr>
+      <w:r>
+        <w:t>{%p if recommendation_4 %}</w:t>
       </w:r>
     </w:p>
     <w:p>
@@ -702,10 +768,34 @@
     </w:p>
     <w:p>
       <w:pPr>
+        <w:spacing w:after="0"/>
+      </w:pPr>
+      <w:r>
+        <w:t>{%p endif %}</w:t>
+      </w:r>
+    </w:p>
+    <w:p>
+      <w:pPr>
+        <w:spacing w:after="0"/>
+      </w:pPr>
+      <w:r>
+        <w:t>{%p if recommendation_5 %}</w:t>
+      </w:r>
+    </w:p>
+    <w:p>
+      <w:pPr>
         <w:pStyle w:val="ListNumber"/>
       </w:pPr>
       <w:r>
         <w:t>{{ recommendation_5 }}</w:t>
+      </w:r>
+    </w:p>
+    <w:p>
+      <w:pPr>
+        <w:spacing w:after="0"/>
+      </w:pPr>
+      <w:r>
+        <w:t>{%p endif %}</w:t>
       </w:r>
     </w:p>
     <w:p>
@@ -722,38 +812,399 @@
       </w:r>
     </w:p>
     <w:p>
+      <w:pPr>
+        <w:spacing w:after="40" w:before="0"/>
+      </w:pPr>
       <w:r>
         <w:rPr>
           <w:rFonts w:ascii="Source Sans 3" w:hAnsi="Source Sans 3"/>
-          <w:color w:val="5A6672"/>
-          <w:sz w:val="16"/>
+          <w:sz w:val="20"/>
         </w:rPr>
-        <w:fldChar w:fldCharType="begin"/>
+        <w:t>1 Purpose &amp; Scope</w:t>
       </w:r>
+    </w:p>
+    <w:p>
+      <w:pPr>
+        <w:spacing w:after="40" w:before="0"/>
+      </w:pPr>
       <w:r>
         <w:rPr>
           <w:rFonts w:ascii="Source Sans 3" w:hAnsi="Source Sans 3"/>
-          <w:color w:val="5A6672"/>
-          <w:sz w:val="16"/>
+          <w:sz w:val="20"/>
         </w:rPr>
-        <w:instrText xml:space="preserve"> TOC \o "1-2" \h \z \u </w:instrText>
+        <w:t>2 Property</w:t>
       </w:r>
+    </w:p>
+    <w:p>
+      <w:pPr>
+        <w:spacing w:after="40" w:before="0"/>
+      </w:pPr>
       <w:r>
         <w:rPr>
           <w:rFonts w:ascii="Source Sans 3" w:hAnsi="Source Sans 3"/>
-          <w:color w:val="5A6672"/>
-          <w:sz w:val="16"/>
+          <w:sz w:val="20"/>
         </w:rPr>
-        <w:fldChar w:fldCharType="end"/>
+        <w:t xml:space="preserve">    2.1 Site Overview</w:t>
       </w:r>
     </w:p>
     <w:p>
+      <w:pPr>
+        <w:spacing w:after="40" w:before="0"/>
+      </w:pPr>
       <w:r>
         <w:rPr>
-          <w:color w:val="5A6672"/>
-          <w:sz w:val="16"/>
+          <w:rFonts w:ascii="Source Sans 3" w:hAnsi="Source Sans 3"/>
+          <w:sz w:val="20"/>
         </w:rPr>
-        <w:t>Update fields in Word (Ctrl+A, F9) to refresh the table of contents.</w:t>
+        <w:t xml:space="preserve">    2.2 Property Identification</w:t>
+      </w:r>
+    </w:p>
+    <w:p>
+      <w:pPr>
+        <w:spacing w:after="40" w:before="0"/>
+      </w:pPr>
+      <w:r>
+        <w:rPr>
+          <w:rFonts w:ascii="Source Sans 3" w:hAnsi="Source Sans 3"/>
+          <w:sz w:val="20"/>
+        </w:rPr>
+        <w:t xml:space="preserve">    2.3 Adjacent Sites &amp; Context</w:t>
+      </w:r>
+    </w:p>
+    <w:p>
+      <w:pPr>
+        <w:spacing w:after="40" w:before="0"/>
+      </w:pPr>
+      <w:r>
+        <w:rPr>
+          <w:rFonts w:ascii="Source Sans 3" w:hAnsi="Source Sans 3"/>
+          <w:sz w:val="20"/>
+        </w:rPr>
+        <w:t>3 Entitlements &amp; Administration</w:t>
+      </w:r>
+    </w:p>
+    <w:p>
+      <w:pPr>
+        <w:spacing w:after="40" w:before="0"/>
+      </w:pPr>
+      <w:r>
+        <w:rPr>
+          <w:rFonts w:ascii="Source Sans 3" w:hAnsi="Source Sans 3"/>
+          <w:sz w:val="20"/>
+        </w:rPr>
+        <w:t xml:space="preserve">    3.1 Zoning &amp; Land Use</w:t>
+      </w:r>
+    </w:p>
+    <w:p>
+      <w:pPr>
+        <w:spacing w:after="40" w:before="0"/>
+      </w:pPr>
+      <w:r>
+        <w:rPr>
+          <w:rFonts w:ascii="Source Sans 3" w:hAnsi="Source Sans 3"/>
+          <w:sz w:val="20"/>
+        </w:rPr>
+        <w:t xml:space="preserve">    3.2 Platting &amp; Subdivision</w:t>
+      </w:r>
+    </w:p>
+    <w:p>
+      <w:pPr>
+        <w:spacing w:after="40" w:before="0"/>
+      </w:pPr>
+      <w:r>
+        <w:rPr>
+          <w:rFonts w:ascii="Source Sans 3" w:hAnsi="Source Sans 3"/>
+          <w:sz w:val="20"/>
+        </w:rPr>
+        <w:t xml:space="preserve">    3.3 Compatibility &amp; Design Standards</w:t>
+      </w:r>
+    </w:p>
+    <w:p>
+      <w:pPr>
+        <w:spacing w:after="40" w:before="0"/>
+      </w:pPr>
+      <w:r>
+        <w:rPr>
+          <w:rFonts w:ascii="Source Sans 3" w:hAnsi="Source Sans 3"/>
+          <w:sz w:val="20"/>
+        </w:rPr>
+        <w:t xml:space="preserve">    3.4 Governing Jurisdictions</w:t>
+      </w:r>
+    </w:p>
+    <w:p>
+      <w:pPr>
+        <w:spacing w:after="40" w:before="0"/>
+      </w:pPr>
+      <w:r>
+        <w:rPr>
+          <w:rFonts w:ascii="Source Sans 3" w:hAnsi="Source Sans 3"/>
+          <w:sz w:val="20"/>
+        </w:rPr>
+        <w:t xml:space="preserve">    3.5 Required Permits</w:t>
+      </w:r>
+    </w:p>
+    <w:p>
+      <w:pPr>
+        <w:spacing w:after="40" w:before="0"/>
+      </w:pPr>
+      <w:r>
+        <w:rPr>
+          <w:rFonts w:ascii="Source Sans 3" w:hAnsi="Source Sans 3"/>
+          <w:sz w:val="20"/>
+        </w:rPr>
+        <w:t xml:space="preserve">    3.6 Permitting Contacts</w:t>
+      </w:r>
+    </w:p>
+    <w:p>
+      <w:pPr>
+        <w:spacing w:after="40" w:before="0"/>
+      </w:pPr>
+      <w:r>
+        <w:rPr>
+          <w:rFonts w:ascii="Source Sans 3" w:hAnsi="Source Sans 3"/>
+          <w:sz w:val="20"/>
+        </w:rPr>
+        <w:t xml:space="preserve">    3.7 Development Agreements</w:t>
+      </w:r>
+    </w:p>
+    <w:p>
+      <w:pPr>
+        <w:spacing w:after="40" w:before="0"/>
+      </w:pPr>
+      <w:r>
+        <w:rPr>
+          <w:rFonts w:ascii="Source Sans 3" w:hAnsi="Source Sans 3"/>
+          <w:sz w:val="20"/>
+        </w:rPr>
+        <w:t xml:space="preserve">    3.8 Easements &amp; Setbacks</w:t>
+      </w:r>
+    </w:p>
+    <w:p>
+      <w:pPr>
+        <w:spacing w:after="40" w:before="0"/>
+      </w:pPr>
+      <w:r>
+        <w:rPr>
+          <w:rFonts w:ascii="Source Sans 3" w:hAnsi="Source Sans 3"/>
+          <w:sz w:val="20"/>
+        </w:rPr>
+        <w:t xml:space="preserve">    3.9 Surveys, Title &amp; Other Documents</w:t>
+      </w:r>
+    </w:p>
+    <w:p>
+      <w:pPr>
+        <w:spacing w:after="40" w:before="0"/>
+      </w:pPr>
+      <w:r>
+        <w:rPr>
+          <w:rFonts w:ascii="Source Sans 3" w:hAnsi="Source Sans 3"/>
+          <w:sz w:val="20"/>
+        </w:rPr>
+        <w:t>4 Site Constraints</w:t>
+      </w:r>
+    </w:p>
+    <w:p>
+      <w:pPr>
+        <w:spacing w:after="40" w:before="0"/>
+      </w:pPr>
+      <w:r>
+        <w:rPr>
+          <w:rFonts w:ascii="Source Sans 3" w:hAnsi="Source Sans 3"/>
+          <w:sz w:val="20"/>
+        </w:rPr>
+        <w:t xml:space="preserve">    4.1 Watershed &amp; Waterways</w:t>
+      </w:r>
+    </w:p>
+    <w:p>
+      <w:pPr>
+        <w:spacing w:after="40" w:before="0"/>
+      </w:pPr>
+      <w:r>
+        <w:rPr>
+          <w:rFonts w:ascii="Source Sans 3" w:hAnsi="Source Sans 3"/>
+          <w:sz w:val="20"/>
+        </w:rPr>
+        <w:t xml:space="preserve">    4.2 Impervious Cover</w:t>
+      </w:r>
+    </w:p>
+    <w:p>
+      <w:pPr>
+        <w:spacing w:after="40" w:before="0"/>
+      </w:pPr>
+      <w:r>
+        <w:rPr>
+          <w:rFonts w:ascii="Source Sans 3" w:hAnsi="Source Sans 3"/>
+          <w:sz w:val="20"/>
+        </w:rPr>
+        <w:t xml:space="preserve">    4.3 Soils, Elevation &amp; Topography</w:t>
+      </w:r>
+    </w:p>
+    <w:p>
+      <w:pPr>
+        <w:spacing w:after="40" w:before="0"/>
+      </w:pPr>
+      <w:r>
+        <w:rPr>
+          <w:rFonts w:ascii="Source Sans 3" w:hAnsi="Source Sans 3"/>
+          <w:sz w:val="20"/>
+        </w:rPr>
+        <w:t xml:space="preserve">    4.4 Floodplain Status</w:t>
+      </w:r>
+    </w:p>
+    <w:p>
+      <w:pPr>
+        <w:spacing w:after="40" w:before="0"/>
+      </w:pPr>
+      <w:r>
+        <w:rPr>
+          <w:rFonts w:ascii="Source Sans 3" w:hAnsi="Source Sans 3"/>
+          <w:sz w:val="20"/>
+        </w:rPr>
+        <w:t xml:space="preserve">    4.5 Drainage Areas &amp; Design Criteria</w:t>
+      </w:r>
+    </w:p>
+    <w:p>
+      <w:pPr>
+        <w:spacing w:after="40" w:before="0"/>
+      </w:pPr>
+      <w:r>
+        <w:rPr>
+          <w:rFonts w:ascii="Source Sans 3" w:hAnsi="Source Sans 3"/>
+          <w:sz w:val="20"/>
+        </w:rPr>
+        <w:t xml:space="preserve">    4.6 Water Quality &amp; Detention</w:t>
+      </w:r>
+    </w:p>
+    <w:p>
+      <w:pPr>
+        <w:spacing w:after="40" w:before="0"/>
+      </w:pPr>
+      <w:r>
+        <w:rPr>
+          <w:rFonts w:ascii="Source Sans 3" w:hAnsi="Source Sans 3"/>
+          <w:sz w:val="20"/>
+        </w:rPr>
+        <w:t xml:space="preserve">    4.7 Environmental Overlays</w:t>
+      </w:r>
+    </w:p>
+    <w:p>
+      <w:pPr>
+        <w:spacing w:after="40" w:before="0"/>
+      </w:pPr>
+      <w:r>
+        <w:rPr>
+          <w:rFonts w:ascii="Source Sans 3" w:hAnsi="Source Sans 3"/>
+          <w:sz w:val="20"/>
+        </w:rPr>
+        <w:t>5 Utilities, Access &amp; Mobility</w:t>
+      </w:r>
+    </w:p>
+    <w:p>
+      <w:pPr>
+        <w:spacing w:after="40" w:before="0"/>
+      </w:pPr>
+      <w:r>
+        <w:rPr>
+          <w:rFonts w:ascii="Source Sans 3" w:hAnsi="Source Sans 3"/>
+          <w:sz w:val="20"/>
+        </w:rPr>
+        <w:t xml:space="preserve">    5.1 Water Service</w:t>
+      </w:r>
+    </w:p>
+    <w:p>
+      <w:pPr>
+        <w:spacing w:after="40" w:before="0"/>
+      </w:pPr>
+      <w:r>
+        <w:rPr>
+          <w:rFonts w:ascii="Source Sans 3" w:hAnsi="Source Sans 3"/>
+          <w:sz w:val="20"/>
+        </w:rPr>
+        <w:t xml:space="preserve">    5.2 Wastewater Service</w:t>
+      </w:r>
+    </w:p>
+    <w:p>
+      <w:pPr>
+        <w:spacing w:after="40" w:before="0"/>
+      </w:pPr>
+      <w:r>
+        <w:rPr>
+          <w:rFonts w:ascii="Source Sans 3" w:hAnsi="Source Sans 3"/>
+          <w:sz w:val="20"/>
+        </w:rPr>
+        <w:t xml:space="preserve">    5.3 Electric Service</w:t>
+      </w:r>
+    </w:p>
+    <w:p>
+      <w:pPr>
+        <w:spacing w:after="40" w:before="0"/>
+      </w:pPr>
+      <w:r>
+        <w:rPr>
+          <w:rFonts w:ascii="Source Sans 3" w:hAnsi="Source Sans 3"/>
+          <w:sz w:val="20"/>
+        </w:rPr>
+        <w:t xml:space="preserve">    5.4 Fire Protection</w:t>
+      </w:r>
+    </w:p>
+    <w:p>
+      <w:pPr>
+        <w:spacing w:after="40" w:before="0"/>
+      </w:pPr>
+      <w:r>
+        <w:rPr>
+          <w:rFonts w:ascii="Source Sans 3" w:hAnsi="Source Sans 3"/>
+          <w:sz w:val="20"/>
+        </w:rPr>
+        <w:t xml:space="preserve">    5.5 Utility Capacity</w:t>
+      </w:r>
+    </w:p>
+    <w:p>
+      <w:pPr>
+        <w:spacing w:after="40" w:before="0"/>
+      </w:pPr>
+      <w:r>
+        <w:rPr>
+          <w:rFonts w:ascii="Source Sans 3" w:hAnsi="Source Sans 3"/>
+          <w:sz w:val="20"/>
+        </w:rPr>
+        <w:t xml:space="preserve">    5.6 Right-of-Way</w:t>
+      </w:r>
+    </w:p>
+    <w:p>
+      <w:pPr>
+        <w:spacing w:after="40" w:before="0"/>
+      </w:pPr>
+      <w:r>
+        <w:rPr>
+          <w:rFonts w:ascii="Source Sans 3" w:hAnsi="Source Sans 3"/>
+          <w:sz w:val="20"/>
+        </w:rPr>
+        <w:t xml:space="preserve">    5.7 Transportation &amp; Access</w:t>
+      </w:r>
+    </w:p>
+    <w:p>
+      <w:pPr>
+        <w:spacing w:after="40" w:before="0"/>
+      </w:pPr>
+      <w:r>
+        <w:rPr>
+          <w:rFonts w:ascii="Source Sans 3" w:hAnsi="Source Sans 3"/>
+          <w:sz w:val="20"/>
+        </w:rPr>
+        <w:t>6 Feasibility Determination</w:t>
+      </w:r>
+    </w:p>
+    <w:p>
+      <w:pPr>
+        <w:spacing w:after="40" w:before="0"/>
+      </w:pPr>
+      <w:r>
+        <w:rPr>
+          <w:rFonts w:ascii="Source Sans 3" w:hAnsi="Source Sans 3"/>
+          <w:sz w:val="20"/>
+        </w:rPr>
+        <w:t>Exhibits</w:t>
       </w:r>
     </w:p>
     <w:p>
@@ -1790,10 +2241,34 @@
     </w:p>
     <w:p>
       <w:pPr>
+        <w:spacing w:after="0"/>
+      </w:pPr>
+      <w:r>
+        <w:t>{%p if recommendation_1 %}</w:t>
+      </w:r>
+    </w:p>
+    <w:p>
+      <w:pPr>
         <w:pStyle w:val="ListNumber"/>
       </w:pPr>
       <w:r>
         <w:t>{{ recommendation_1 }}</w:t>
+      </w:r>
+    </w:p>
+    <w:p>
+      <w:pPr>
+        <w:spacing w:after="0"/>
+      </w:pPr>
+      <w:r>
+        <w:t>{%p endif %}</w:t>
+      </w:r>
+    </w:p>
+    <w:p>
+      <w:pPr>
+        <w:spacing w:after="0"/>
+      </w:pPr>
+      <w:r>
+        <w:t>{%p if recommendation_2 %}</w:t>
       </w:r>
     </w:p>
     <w:p>
@@ -1806,10 +2281,42 @@
     </w:p>
     <w:p>
       <w:pPr>
+        <w:spacing w:after="0"/>
+      </w:pPr>
+      <w:r>
+        <w:t>{%p endif %}</w:t>
+      </w:r>
+    </w:p>
+    <w:p>
+      <w:pPr>
+        <w:spacing w:after="0"/>
+      </w:pPr>
+      <w:r>
+        <w:t>{%p if recommendation_3 %}</w:t>
+      </w:r>
+    </w:p>
+    <w:p>
+      <w:pPr>
         <w:pStyle w:val="ListNumber"/>
       </w:pPr>
       <w:r>
         <w:t>{{ recommendation_3 }}</w:t>
+      </w:r>
+    </w:p>
+    <w:p>
+      <w:pPr>
+        <w:spacing w:after="0"/>
+      </w:pPr>
+      <w:r>
+        <w:t>{%p endif %}</w:t>
+      </w:r>
+    </w:p>
+    <w:p>
+      <w:pPr>
+        <w:spacing w:after="0"/>
+      </w:pPr>
+      <w:r>
+        <w:t>{%p if recommendation_4 %}</w:t>
       </w:r>
     </w:p>
     <w:p>
@@ -1822,6 +2329,22 @@
     </w:p>
     <w:p>
       <w:pPr>
+        <w:spacing w:after="0"/>
+      </w:pPr>
+      <w:r>
+        <w:t>{%p endif %}</w:t>
+      </w:r>
+    </w:p>
+    <w:p>
+      <w:pPr>
+        <w:spacing w:after="0"/>
+      </w:pPr>
+      <w:r>
+        <w:t>{%p if recommendation_5 %}</w:t>
+      </w:r>
+    </w:p>
+    <w:p>
+      <w:pPr>
         <w:pStyle w:val="ListNumber"/>
       </w:pPr>
       <w:r>
@@ -1830,13 +2353,16 @@
     </w:p>
     <w:p>
       <w:pPr>
-        <w:sectPr>
-          <w:pgSz w:w="12240" w:h="15840"/>
-          <w:pgMar w:top="1296" w:right="1440" w:bottom="1296" w:left="1440" w:header="720" w:footer="720" w:gutter="0"/>
-          <w:cols w:space="720"/>
-          <w:docGrid w:linePitch="360"/>
-        </w:sectPr>
+        <w:spacing w:after="0"/>
       </w:pPr>
+      <w:r>
+        <w:t>{%p endif %}</w:t>
+      </w:r>
+    </w:p>
+    <w:p>
+      <w:r>
+        <w:br w:type="page"/>
+      </w:r>
     </w:p>
     <w:p>
       <w:pPr>

</xml_diff>